<commit_message>
Updating paper form files
</commit_message>
<xml_diff>
--- a/app/files/record-a-vaccination.docx
+++ b/app/files/record-a-vaccination.docx
@@ -1,6 +1,6 @@
 
 <file path=word/document.xml><?xml version="1.0" encoding="utf-8"?>
-<w:document xmlns:wpc="http://schemas.microsoft.com/office/word/2010/wordprocessingCanvas" xmlns:cx="http://schemas.microsoft.com/office/drawing/2014/chartex" xmlns:cx1="http://schemas.microsoft.com/office/drawing/2015/9/8/chartex" xmlns:cx2="http://schemas.microsoft.com/office/drawing/2015/10/21/chartex" xmlns:cx3="http://schemas.microsoft.com/office/drawing/2016/5/9/chartex" xmlns:cx4="http://schemas.microsoft.com/office/drawing/2016/5/10/chartex" xmlns:cx5="http://schemas.microsoft.com/office/drawing/2016/5/11/chartex" xmlns:cx6="http://schemas.microsoft.com/office/drawing/2016/5/12/chartex" xmlns:cx7="http://schemas.microsoft.com/office/drawing/2016/5/13/chartex" xmlns:cx8="http://schemas.microsoft.com/office/drawing/2016/5/14/chartex" xmlns:mc="http://schemas.openxmlformats.org/markup-compatibility/2006" xmlns:aink="http://schemas.microsoft.com/office/drawing/2016/ink" xmlns:am3d="http://schemas.microsoft.com/office/drawing/2017/model3d" xmlns:o="urn:schemas-microsoft-com:office:office" xmlns:oel="http://schemas.microsoft.com/office/2019/extlst" xmlns:r="http://schemas.openxmlformats.org/officeDocument/2006/relationships" xmlns:m="http://schemas.openxmlformats.org/officeDocument/2006/math" xmlns:v="urn:schemas-microsoft-com:vml" xmlns:wp14="http://schemas.microsoft.com/office/word/2010/wordprocessingDrawing" xmlns:wp="http://schemas.openxmlformats.org/drawingml/2006/wordprocessingDrawing" xmlns:w10="urn:schemas-microsoft-com:office:word" xmlns:w="http://schemas.openxmlformats.org/wordprocessingml/2006/main" xmlns:w14="http://schemas.microsoft.com/office/word/2010/wordml" xmlns:w15="http://schemas.microsoft.com/office/word/2012/wordml" xmlns:w16cex="http://schemas.microsoft.com/office/word/2018/wordml/cex" xmlns:w16cid="http://schemas.microsoft.com/office/word/2016/wordml/cid" xmlns:w16="http://schemas.microsoft.com/office/word/2018/wordml" xmlns:w16du="http://schemas.microsoft.com/office/word/2023/wordml/word16du" xmlns:w16sdtdh="http://schemas.microsoft.com/office/word/2020/wordml/sdtdatahash" xmlns:w16sdtfl="http://schemas.microsoft.com/office/word/2024/wordml/sdtformatlock" xmlns:w16se="http://schemas.microsoft.com/office/word/2015/wordml/symex" xmlns:wpg="http://schemas.microsoft.com/office/word/2010/wordprocessingGroup" xmlns:wpi="http://schemas.microsoft.com/office/word/2010/wordprocessingInk" xmlns:wne="http://schemas.microsoft.com/office/word/2006/wordml" xmlns:wps="http://schemas.microsoft.com/office/word/2010/wordprocessingShape" mc:Ignorable="w14 w15 w16se w16cid w16 w16cex w16sdtdh w16sdtfl w16du wp14">
+<w:document xmlns:wpc="http://schemas.microsoft.com/office/word/2010/wordprocessingCanvas" xmlns:cx="http://schemas.microsoft.com/office/drawing/2014/chartex" xmlns:cx1="http://schemas.microsoft.com/office/drawing/2015/9/8/chartex" xmlns:cx2="http://schemas.microsoft.com/office/drawing/2015/10/21/chartex" xmlns:cx3="http://schemas.microsoft.com/office/drawing/2016/5/9/chartex" xmlns:cx4="http://schemas.microsoft.com/office/drawing/2016/5/10/chartex" xmlns:cx5="http://schemas.microsoft.com/office/drawing/2016/5/11/chartex" xmlns:cx6="http://schemas.microsoft.com/office/drawing/2016/5/12/chartex" xmlns:cx7="http://schemas.microsoft.com/office/drawing/2016/5/13/chartex" xmlns:cx8="http://schemas.microsoft.com/office/drawing/2016/5/14/chartex" xmlns:mc="http://schemas.openxmlformats.org/markup-compatibility/2006" xmlns:aink="http://schemas.microsoft.com/office/drawing/2016/ink" xmlns:am3d="http://schemas.microsoft.com/office/drawing/2017/model3d" xmlns:o="urn:schemas-microsoft-com:office:office" xmlns:oel="http://schemas.microsoft.com/office/2019/extlst" xmlns:r="http://schemas.openxmlformats.org/officeDocument/2006/relationships" xmlns:m="http://schemas.openxmlformats.org/officeDocument/2006/math" xmlns:v="urn:schemas-microsoft-com:vml" xmlns:wp14="http://schemas.microsoft.com/office/word/2010/wordprocessingDrawing" xmlns:wp="http://schemas.openxmlformats.org/drawingml/2006/wordprocessingDrawing" xmlns:w10="urn:schemas-microsoft-com:office:word" xmlns:w="http://schemas.openxmlformats.org/wordprocessingml/2006/main" xmlns:w14="http://schemas.microsoft.com/office/word/2010/wordml" xmlns:w15="http://schemas.microsoft.com/office/word/2012/wordml" xmlns:w16cei="http://schemas.microsoft.com/office/word/2026/wordml/cei" xmlns:w16cex="http://schemas.microsoft.com/office/word/2018/wordml/cex" xmlns:w16cid="http://schemas.microsoft.com/office/word/2016/wordml/cid" xmlns:w16="http://schemas.microsoft.com/office/word/2018/wordml" xmlns:w16du="http://schemas.microsoft.com/office/word/2023/wordml/word16du" xmlns:w16sdtdh="http://schemas.microsoft.com/office/word/2020/wordml/sdtdatahash" xmlns:w16sdtfl="http://schemas.microsoft.com/office/word/2024/wordml/sdtformatlock" xmlns:w16se="http://schemas.microsoft.com/office/word/2015/wordml/symex" xmlns:wpg="http://schemas.microsoft.com/office/word/2010/wordprocessingGroup" xmlns:wpi="http://schemas.microsoft.com/office/word/2010/wordprocessingInk" xmlns:wne="http://schemas.microsoft.com/office/word/2006/wordml" xmlns:wps="http://schemas.microsoft.com/office/word/2010/wordprocessingShape" mc:Ignorable="w14 w15 w16se w16cid w16 w16cex w16sdtdh w16sdtfl w16du wp14">
   <w:body>
     <w:p>
       <w:pPr>
@@ -8,14 +8,16 @@
         <w:rPr>
           <w:rFonts w:ascii="Arial" w:eastAsia="Arial" w:hAnsi="Arial" w:cs="Arial"/>
           <w:color w:val="auto"/>
-          <w:sz w:val="24"/>
-          <w:szCs w:val="24"/>
+          <w:sz w:val="36"/>
+          <w:szCs w:val="36"/>
         </w:rPr>
       </w:pPr>
       <w:r>
         <w:rPr>
           <w:rFonts w:ascii="Arial" w:eastAsia="Arial" w:hAnsi="Arial" w:cs="Arial"/>
           <w:color w:val="auto"/>
+          <w:sz w:val="36"/>
+          <w:szCs w:val="36"/>
         </w:rPr>
         <w:t>Record a vaccination</w:t>
       </w:r>
@@ -23,6 +25,8 @@
         <w:rPr>
           <w:rFonts w:ascii="Arial" w:eastAsia="Arial" w:hAnsi="Arial" w:cs="Arial"/>
           <w:color w:val="auto"/>
+          <w:sz w:val="36"/>
+          <w:szCs w:val="36"/>
         </w:rPr>
         <w:t xml:space="preserve"> form</w:t>
       </w:r>
@@ -397,8 +401,8 @@
         <w:tblLook w:val="04A0" w:firstRow="1" w:lastRow="0" w:firstColumn="1" w:lastColumn="0" w:noHBand="0" w:noVBand="1"/>
       </w:tblPr>
       <w:tblGrid>
-        <w:gridCol w:w="4111"/>
-        <w:gridCol w:w="4909"/>
+        <w:gridCol w:w="4605"/>
+        <w:gridCol w:w="4415"/>
       </w:tblGrid>
       <w:tr>
         <w:trPr>
@@ -406,7 +410,7 @@
         </w:trPr>
         <w:tc>
           <w:tcPr>
-            <w:tcW w:w="4111" w:type="dxa"/>
+            <w:tcW w:w="4605" w:type="dxa"/>
           </w:tcPr>
           <w:p>
             <w:pPr>
@@ -428,7 +432,7 @@
         </w:tc>
         <w:tc>
           <w:tcPr>
-            <w:tcW w:w="4909" w:type="dxa"/>
+            <w:tcW w:w="4415" w:type="dxa"/>
           </w:tcPr>
           <w:p>
             <w:pPr>
@@ -447,7 +451,7 @@
         </w:trPr>
         <w:tc>
           <w:tcPr>
-            <w:tcW w:w="4111" w:type="dxa"/>
+            <w:tcW w:w="4605" w:type="dxa"/>
           </w:tcPr>
           <w:p>
             <w:pPr>
@@ -511,7 +515,7 @@
         </w:tc>
         <w:tc>
           <w:tcPr>
-            <w:tcW w:w="4909" w:type="dxa"/>
+            <w:tcW w:w="4415" w:type="dxa"/>
           </w:tcPr>
           <w:p>
             <w:pPr>
@@ -530,7 +534,7 @@
         </w:trPr>
         <w:tc>
           <w:tcPr>
-            <w:tcW w:w="4111" w:type="dxa"/>
+            <w:tcW w:w="4605" w:type="dxa"/>
           </w:tcPr>
           <w:p>
             <w:pPr>
@@ -552,7 +556,7 @@
         </w:tc>
         <w:tc>
           <w:tcPr>
-            <w:tcW w:w="4909" w:type="dxa"/>
+            <w:tcW w:w="4415" w:type="dxa"/>
           </w:tcPr>
           <w:p>
             <w:pPr>
@@ -571,7 +575,7 @@
         </w:trPr>
         <w:tc>
           <w:tcPr>
-            <w:tcW w:w="4111" w:type="dxa"/>
+            <w:tcW w:w="4605" w:type="dxa"/>
           </w:tcPr>
           <w:p>
             <w:pPr>
@@ -593,7 +597,58 @@
         </w:tc>
         <w:tc>
           <w:tcPr>
-            <w:tcW w:w="4909" w:type="dxa"/>
+            <w:tcW w:w="4415" w:type="dxa"/>
+          </w:tcPr>
+          <w:p>
+            <w:pPr>
+              <w:rPr>
+                <w:rFonts w:ascii="Arial" w:eastAsia="Arial Nova" w:hAnsi="Arial" w:cs="Arial"/>
+                <w:sz w:val="24"/>
+                <w:szCs w:val="24"/>
+              </w:rPr>
+            </w:pPr>
+          </w:p>
+        </w:tc>
+      </w:tr>
+      <w:tr>
+        <w:trPr>
+          <w:trHeight w:val="397"/>
+        </w:trPr>
+        <w:tc>
+          <w:tcPr>
+            <w:tcW w:w="4605" w:type="dxa"/>
+          </w:tcPr>
+          <w:p>
+            <w:r>
+              <w:rPr>
+                <w:rFonts w:ascii="Arial" w:eastAsia="Arial Nova" w:hAnsi="Arial" w:cs="Arial"/>
+                <w:sz w:val="24"/>
+                <w:szCs w:val="24"/>
+              </w:rPr>
+              <w:t>Dose sequence (for example, 1</w:t>
+            </w:r>
+            <w:r>
+              <w:rPr>
+                <w:rFonts w:ascii="Arial" w:eastAsia="Arial Nova" w:hAnsi="Arial" w:cs="Arial"/>
+                <w:sz w:val="24"/>
+                <w:szCs w:val="24"/>
+                <w:vertAlign w:val="superscript"/>
+              </w:rPr>
+              <w:t>st</w:t>
+            </w:r>
+            <w:r>
+              <w:rPr>
+                <w:rFonts w:ascii="Arial" w:eastAsia="Arial Nova" w:hAnsi="Arial" w:cs="Arial"/>
+                <w:sz w:val="24"/>
+                <w:szCs w:val="24"/>
+              </w:rPr>
+              <w:t xml:space="preserve"> dose)</w:t>
+            </w:r>
+          </w:p>
+        </w:tc>
+        <w:tc>
+          <w:tcPr>
+            <w:tcW w:w="4415" w:type="dxa"/>
           </w:tcPr>
           <w:p>
             <w:pPr>
@@ -777,64 +832,7 @@
           <w:sz w:val="24"/>
           <w:szCs w:val="24"/>
         </w:rPr>
-        <w:t xml:space="preserve"> </w:t>
-      </w:r>
-      <w:r>
-        <w:br/>
-      </w:r>
-      <w:r>
-        <w:rPr>
-          <w:rFonts w:ascii="Arial" w:hAnsi="Arial" w:cs="Arial"/>
-          <w:color w:val="auto"/>
-          <w:sz w:val="24"/>
-          <w:szCs w:val="24"/>
-        </w:rPr>
-        <w:t xml:space="preserve">(only </w:t>
-      </w:r>
-      <w:r>
-        <w:rPr>
-          <w:rFonts w:ascii="Arial" w:hAnsi="Arial" w:cs="Arial"/>
-          <w:color w:val="auto"/>
-          <w:sz w:val="24"/>
-          <w:szCs w:val="24"/>
-        </w:rPr>
-        <w:t xml:space="preserve">for flu </w:t>
-      </w:r>
-      <w:r>
-        <w:rPr>
-          <w:rFonts w:ascii="Arial" w:hAnsi="Arial" w:cs="Arial"/>
-          <w:color w:val="auto"/>
-          <w:sz w:val="24"/>
-          <w:szCs w:val="24"/>
-        </w:rPr>
-        <w:t xml:space="preserve">if the patient is </w:t>
-      </w:r>
-      <w:r>
-        <w:rPr>
-          <w:rFonts w:ascii="Arial" w:hAnsi="Arial" w:cs="Arial"/>
-          <w:color w:val="auto"/>
-          <w:sz w:val="24"/>
-          <w:szCs w:val="24"/>
-        </w:rPr>
-        <w:t>eligible because they are a healthcare worker</w:t>
-      </w:r>
-      <w:r>
-        <w:rPr>
-          <w:rFonts w:ascii="Arial" w:hAnsi="Arial" w:cs="Arial"/>
-          <w:color w:val="auto"/>
-          <w:sz w:val="24"/>
-          <w:szCs w:val="24"/>
-        </w:rPr>
-        <w:t>)</w:t>
-      </w:r>
-      <w:r>
-        <w:rPr>
-          <w:rFonts w:ascii="Arial" w:eastAsia="Arial Nova" w:hAnsi="Arial" w:cs="Arial"/>
-          <w:color w:val="auto"/>
-          <w:sz w:val="24"/>
-          <w:szCs w:val="24"/>
-        </w:rPr>
-        <w:t xml:space="preserve"> </w:t>
+        <w:t xml:space="preserve">  </w:t>
       </w:r>
     </w:p>
     <w:tbl>
@@ -900,6 +898,7 @@
                   <w14:uncheckedState w14:val="2610" w14:font="MS Gothic"/>
                 </w14:checkbox>
               </w:sdtPr>
+              <w:sdtEndPr/>
               <w:sdtContent>
                 <w:r>
                   <w:rPr>
@@ -951,6 +950,7 @@
                   <w14:uncheckedState w14:val="2610" w14:font="MS Gothic"/>
                 </w14:checkbox>
               </w:sdtPr>
+              <w:sdtEndPr/>
               <w:sdtContent>
                 <w:r>
                   <w:rPr>
@@ -1002,10 +1002,11 @@
                   <w14:uncheckedState w14:val="2610" w14:font="MS Gothic"/>
                 </w14:checkbox>
               </w:sdtPr>
+              <w:sdtEndPr/>
               <w:sdtContent>
                 <w:r>
                   <w:rPr>
-                    <w:rFonts w:ascii="MS Gothic" w:eastAsia="MS Gothic" w:hAnsi="MS Gothic" w:cs="Arial" w:hint="eastAsia"/>
+                    <w:rFonts w:ascii="Segoe UI Symbol" w:eastAsia="Arial Nova" w:hAnsi="Segoe UI Symbol" w:cs="Segoe UI Symbol"/>
                     <w:sz w:val="24"/>
                     <w:szCs w:val="24"/>
                   </w:rPr>
@@ -1053,6 +1054,7 @@
                   <w14:uncheckedState w14:val="2610" w14:font="MS Gothic"/>
                 </w14:checkbox>
               </w:sdtPr>
+              <w:sdtEndPr/>
               <w:sdtContent>
                 <w:r>
                   <w:rPr>
@@ -1104,6 +1106,7 @@
                   <w14:uncheckedState w14:val="2610" w14:font="MS Gothic"/>
                 </w14:checkbox>
               </w:sdtPr>
+              <w:sdtEndPr/>
               <w:sdtContent>
                 <w:r>
                   <w:rPr>
@@ -1266,7 +1269,6 @@
       <w:pPr>
         <w:pStyle w:val="Heading2"/>
         <w:rPr>
-          <w:rFonts w:ascii="Arial" w:hAnsi="Arial" w:cs="Arial"/>
           <w:color w:val="auto"/>
           <w:sz w:val="24"/>
           <w:szCs w:val="24"/>
@@ -1300,16 +1302,7 @@
           <w:sz w:val="24"/>
           <w:szCs w:val="24"/>
         </w:rPr>
-        <w:t xml:space="preserve"> </w:t>
-      </w:r>
-      <w:r>
-        <w:rPr>
-          <w:rFonts w:ascii="Arial" w:hAnsi="Arial" w:cs="Arial"/>
-          <w:color w:val="auto"/>
-          <w:sz w:val="24"/>
-          <w:szCs w:val="24"/>
-        </w:rPr>
-        <w:t>(only for COVID-19)</w:t>
+        <w:t xml:space="preserve"> (only for COVID-19)</w:t>
       </w:r>
     </w:p>
     <w:tbl>
@@ -1352,6 +1345,7 @@
                   <w14:uncheckedState w14:val="2610" w14:font="MS Gothic"/>
                 </w14:checkbox>
               </w:sdtPr>
+              <w:sdtEndPr/>
               <w:sdtContent>
                 <w:r>
                   <w:rPr>
@@ -1403,6 +1397,7 @@
                   <w14:uncheckedState w14:val="2610" w14:font="MS Gothic"/>
                 </w14:checkbox>
               </w:sdtPr>
+              <w:sdtEndPr/>
               <w:sdtContent>
                 <w:r>
                   <w:rPr>
@@ -1455,6 +1450,7 @@
                   <w14:uncheckedState w14:val="2610" w14:font="MS Gothic"/>
                 </w14:checkbox>
               </w:sdtPr>
+              <w:sdtEndPr/>
               <w:sdtContent>
                 <w:r>
                   <w:rPr>
@@ -1506,6 +1502,7 @@
                   <w14:uncheckedState w14:val="2610" w14:font="MS Gothic"/>
                 </w14:checkbox>
               </w:sdtPr>
+              <w:sdtEndPr/>
               <w:sdtContent>
                 <w:r>
                   <w:rPr>
@@ -1913,6 +1910,7 @@
                   <w14:uncheckedState w14:val="2610" w14:font="MS Gothic"/>
                 </w14:checkbox>
               </w:sdtPr>
+              <w:sdtEndPr/>
               <w:sdtContent>
                 <w:r>
                   <w:rPr>
@@ -1962,6 +1960,7 @@
                   <w14:uncheckedState w14:val="2610" w14:font="MS Gothic"/>
                 </w14:checkbox>
               </w:sdtPr>
+              <w:sdtEndPr/>
               <w:sdtContent>
                 <w:r>
                   <w:rPr>
@@ -2011,6 +2010,7 @@
                   <w14:uncheckedState w14:val="2610" w14:font="MS Gothic"/>
                 </w14:checkbox>
               </w:sdtPr>
+              <w:sdtEndPr/>
               <w:sdtContent>
                 <w:r>
                   <w:rPr>
@@ -2060,6 +2060,7 @@
                   <w14:uncheckedState w14:val="2610" w14:font="MS Gothic"/>
                 </w14:checkbox>
               </w:sdtPr>
+              <w:sdtEndPr/>
               <w:sdtContent>
                 <w:r>
                   <w:rPr>
@@ -2208,6 +2209,7 @@
                   <w14:uncheckedState w14:val="2610" w14:font="MS Gothic"/>
                 </w14:checkbox>
               </w:sdtPr>
+              <w:sdtEndPr/>
               <w:sdtContent>
                 <w:r>
                   <w:rPr>
@@ -2259,6 +2261,7 @@
                   <w14:uncheckedState w14:val="2610" w14:font="MS Gothic"/>
                 </w14:checkbox>
               </w:sdtPr>
+              <w:sdtEndPr/>
               <w:sdtContent>
                 <w:r>
                   <w:rPr>
@@ -2310,6 +2313,7 @@
                   <w14:uncheckedState w14:val="2610" w14:font="MS Gothic"/>
                 </w14:checkbox>
               </w:sdtPr>
+              <w:sdtEndPr/>
               <w:sdtContent>
                 <w:r>
                   <w:rPr>
@@ -2361,6 +2365,7 @@
                   <w14:uncheckedState w14:val="2610" w14:font="MS Gothic"/>
                 </w14:checkbox>
               </w:sdtPr>
+              <w:sdtEndPr/>
               <w:sdtContent>
                 <w:r>
                   <w:rPr>
@@ -2404,6 +2409,7 @@
                   <w14:uncheckedState w14:val="2610" w14:font="MS Gothic"/>
                 </w14:checkbox>
               </w:sdtPr>
+              <w:sdtEndPr/>
               <w:sdtContent>
                 <w:r>
                   <w:rPr>
@@ -2455,6 +2461,7 @@
                   <w14:uncheckedState w14:val="2610" w14:font="MS Gothic"/>
                 </w14:checkbox>
               </w:sdtPr>
+              <w:sdtEndPr/>
               <w:sdtContent>
                 <w:r>
                   <w:rPr>
@@ -2702,6 +2709,7 @@
                   <w14:uncheckedState w14:val="2610" w14:font="MS Gothic"/>
                 </w14:checkbox>
               </w:sdtPr>
+              <w:sdtEndPr/>
               <w:sdtContent>
                 <w:r>
                   <w:rPr>
@@ -2753,6 +2761,7 @@
                   <w14:uncheckedState w14:val="2610" w14:font="MS Gothic"/>
                 </w14:checkbox>
               </w:sdtPr>
+              <w:sdtEndPr/>
               <w:sdtContent>
                 <w:r>
                   <w:rPr>
@@ -2796,6 +2805,7 @@
                   <w14:uncheckedState w14:val="2610" w14:font="MS Gothic"/>
                 </w14:checkbox>
               </w:sdtPr>
+              <w:sdtEndPr/>
               <w:sdtContent>
                 <w:r>
                   <w:rPr>
@@ -2847,6 +2857,7 @@
                   <w14:uncheckedState w14:val="2610" w14:font="MS Gothic"/>
                 </w14:checkbox>
               </w:sdtPr>
+              <w:sdtEndPr/>
               <w:sdtContent>
                 <w:r>
                   <w:rPr>
@@ -2898,6 +2909,7 @@
                   <w14:uncheckedState w14:val="2610" w14:font="MS Gothic"/>
                 </w14:checkbox>
               </w:sdtPr>
+              <w:sdtEndPr/>
               <w:sdtContent>
                 <w:r>
                   <w:rPr>
@@ -2949,6 +2961,7 @@
                   <w14:uncheckedState w14:val="2610" w14:font="MS Gothic"/>
                 </w14:checkbox>
               </w:sdtPr>
+              <w:sdtEndPr/>
               <w:sdtContent>
                 <w:r>
                   <w:rPr>
@@ -3132,6 +3145,7 @@
                   <w14:uncheckedState w14:val="2610" w14:font="MS Gothic"/>
                 </w14:checkbox>
               </w:sdtPr>
+              <w:sdtEndPr/>
               <w:sdtContent>
                 <w:r>
                   <w:rPr>
@@ -3184,6 +3198,7 @@
                   <w14:uncheckedState w14:val="2610" w14:font="MS Gothic"/>
                 </w14:checkbox>
               </w:sdtPr>
+              <w:sdtEndPr/>
               <w:sdtContent>
                 <w:r>
                   <w:rPr>
@@ -3243,7 +3258,7 @@
 </file>
 
 <file path=word/endnotes.xml><?xml version="1.0" encoding="utf-8"?>
-<w:endnotes xmlns:wpc="http://schemas.microsoft.com/office/word/2010/wordprocessingCanvas" xmlns:cx="http://schemas.microsoft.com/office/drawing/2014/chartex" xmlns:cx1="http://schemas.microsoft.com/office/drawing/2015/9/8/chartex" xmlns:cx2="http://schemas.microsoft.com/office/drawing/2015/10/21/chartex" xmlns:cx3="http://schemas.microsoft.com/office/drawing/2016/5/9/chartex" xmlns:cx4="http://schemas.microsoft.com/office/drawing/2016/5/10/chartex" xmlns:cx5="http://schemas.microsoft.com/office/drawing/2016/5/11/chartex" xmlns:cx6="http://schemas.microsoft.com/office/drawing/2016/5/12/chartex" xmlns:cx7="http://schemas.microsoft.com/office/drawing/2016/5/13/chartex" xmlns:cx8="http://schemas.microsoft.com/office/drawing/2016/5/14/chartex" xmlns:mc="http://schemas.openxmlformats.org/markup-compatibility/2006" xmlns:aink="http://schemas.microsoft.com/office/drawing/2016/ink" xmlns:am3d="http://schemas.microsoft.com/office/drawing/2017/model3d" xmlns:o="urn:schemas-microsoft-com:office:office" xmlns:oel="http://schemas.microsoft.com/office/2019/extlst" xmlns:r="http://schemas.openxmlformats.org/officeDocument/2006/relationships" xmlns:m="http://schemas.openxmlformats.org/officeDocument/2006/math" xmlns:v="urn:schemas-microsoft-com:vml" xmlns:wp14="http://schemas.microsoft.com/office/word/2010/wordprocessingDrawing" xmlns:wp="http://schemas.openxmlformats.org/drawingml/2006/wordprocessingDrawing" xmlns:w10="urn:schemas-microsoft-com:office:word" xmlns:w="http://schemas.openxmlformats.org/wordprocessingml/2006/main" xmlns:w14="http://schemas.microsoft.com/office/word/2010/wordml" xmlns:w15="http://schemas.microsoft.com/office/word/2012/wordml" xmlns:w16cex="http://schemas.microsoft.com/office/word/2018/wordml/cex" xmlns:w16cid="http://schemas.microsoft.com/office/word/2016/wordml/cid" xmlns:w16="http://schemas.microsoft.com/office/word/2018/wordml" xmlns:w16du="http://schemas.microsoft.com/office/word/2023/wordml/word16du" xmlns:w16sdtdh="http://schemas.microsoft.com/office/word/2020/wordml/sdtdatahash" xmlns:w16sdtfl="http://schemas.microsoft.com/office/word/2024/wordml/sdtformatlock" xmlns:w16se="http://schemas.microsoft.com/office/word/2015/wordml/symex" xmlns:wpg="http://schemas.microsoft.com/office/word/2010/wordprocessingGroup" xmlns:wpi="http://schemas.microsoft.com/office/word/2010/wordprocessingInk" xmlns:wne="http://schemas.microsoft.com/office/word/2006/wordml" xmlns:wps="http://schemas.microsoft.com/office/word/2010/wordprocessingShape" mc:Ignorable="w14 w15 w16se w16cid w16 w16cex w16sdtdh w16sdtfl w16du wp14">
+<w:endnotes xmlns:wpc="http://schemas.microsoft.com/office/word/2010/wordprocessingCanvas" xmlns:cx="http://schemas.microsoft.com/office/drawing/2014/chartex" xmlns:cx1="http://schemas.microsoft.com/office/drawing/2015/9/8/chartex" xmlns:cx2="http://schemas.microsoft.com/office/drawing/2015/10/21/chartex" xmlns:cx3="http://schemas.microsoft.com/office/drawing/2016/5/9/chartex" xmlns:cx4="http://schemas.microsoft.com/office/drawing/2016/5/10/chartex" xmlns:cx5="http://schemas.microsoft.com/office/drawing/2016/5/11/chartex" xmlns:cx6="http://schemas.microsoft.com/office/drawing/2016/5/12/chartex" xmlns:cx7="http://schemas.microsoft.com/office/drawing/2016/5/13/chartex" xmlns:cx8="http://schemas.microsoft.com/office/drawing/2016/5/14/chartex" xmlns:mc="http://schemas.openxmlformats.org/markup-compatibility/2006" xmlns:aink="http://schemas.microsoft.com/office/drawing/2016/ink" xmlns:am3d="http://schemas.microsoft.com/office/drawing/2017/model3d" xmlns:o="urn:schemas-microsoft-com:office:office" xmlns:oel="http://schemas.microsoft.com/office/2019/extlst" xmlns:r="http://schemas.openxmlformats.org/officeDocument/2006/relationships" xmlns:m="http://schemas.openxmlformats.org/officeDocument/2006/math" xmlns:v="urn:schemas-microsoft-com:vml" xmlns:wp14="http://schemas.microsoft.com/office/word/2010/wordprocessingDrawing" xmlns:wp="http://schemas.openxmlformats.org/drawingml/2006/wordprocessingDrawing" xmlns:w10="urn:schemas-microsoft-com:office:word" xmlns:w="http://schemas.openxmlformats.org/wordprocessingml/2006/main" xmlns:w14="http://schemas.microsoft.com/office/word/2010/wordml" xmlns:w15="http://schemas.microsoft.com/office/word/2012/wordml" xmlns:w16cei="http://schemas.microsoft.com/office/word/2026/wordml/cei" xmlns:w16cex="http://schemas.microsoft.com/office/word/2018/wordml/cex" xmlns:w16cid="http://schemas.microsoft.com/office/word/2016/wordml/cid" xmlns:w16="http://schemas.microsoft.com/office/word/2018/wordml" xmlns:w16du="http://schemas.microsoft.com/office/word/2023/wordml/word16du" xmlns:w16sdtdh="http://schemas.microsoft.com/office/word/2020/wordml/sdtdatahash" xmlns:w16sdtfl="http://schemas.microsoft.com/office/word/2024/wordml/sdtformatlock" xmlns:w16se="http://schemas.microsoft.com/office/word/2015/wordml/symex" xmlns:wpg="http://schemas.microsoft.com/office/word/2010/wordprocessingGroup" xmlns:wpi="http://schemas.microsoft.com/office/word/2010/wordprocessingInk" xmlns:wne="http://schemas.microsoft.com/office/word/2006/wordml" xmlns:wps="http://schemas.microsoft.com/office/word/2010/wordprocessingShape" mc:Ignorable="w14 w15 w16se w16cid w16 w16cex w16sdtdh w16sdtfl w16du wp14">
   <w:endnote w:type="separator" w:id="-1">
     <w:p>
       <w:pPr>
@@ -3268,7 +3283,7 @@
 </file>
 
 <file path=word/footer1.xml><?xml version="1.0" encoding="utf-8"?>
-<w:ftr xmlns:wpc="http://schemas.microsoft.com/office/word/2010/wordprocessingCanvas" xmlns:cx="http://schemas.microsoft.com/office/drawing/2014/chartex" xmlns:cx1="http://schemas.microsoft.com/office/drawing/2015/9/8/chartex" xmlns:cx2="http://schemas.microsoft.com/office/drawing/2015/10/21/chartex" xmlns:cx3="http://schemas.microsoft.com/office/drawing/2016/5/9/chartex" xmlns:cx4="http://schemas.microsoft.com/office/drawing/2016/5/10/chartex" xmlns:cx5="http://schemas.microsoft.com/office/drawing/2016/5/11/chartex" xmlns:cx6="http://schemas.microsoft.com/office/drawing/2016/5/12/chartex" xmlns:cx7="http://schemas.microsoft.com/office/drawing/2016/5/13/chartex" xmlns:cx8="http://schemas.microsoft.com/office/drawing/2016/5/14/chartex" xmlns:mc="http://schemas.openxmlformats.org/markup-compatibility/2006" xmlns:aink="http://schemas.microsoft.com/office/drawing/2016/ink" xmlns:am3d="http://schemas.microsoft.com/office/drawing/2017/model3d" xmlns:o="urn:schemas-microsoft-com:office:office" xmlns:oel="http://schemas.microsoft.com/office/2019/extlst" xmlns:r="http://schemas.openxmlformats.org/officeDocument/2006/relationships" xmlns:m="http://schemas.openxmlformats.org/officeDocument/2006/math" xmlns:v="urn:schemas-microsoft-com:vml" xmlns:wp14="http://schemas.microsoft.com/office/word/2010/wordprocessingDrawing" xmlns:wp="http://schemas.openxmlformats.org/drawingml/2006/wordprocessingDrawing" xmlns:w10="urn:schemas-microsoft-com:office:word" xmlns:w="http://schemas.openxmlformats.org/wordprocessingml/2006/main" xmlns:w14="http://schemas.microsoft.com/office/word/2010/wordml" xmlns:w15="http://schemas.microsoft.com/office/word/2012/wordml" xmlns:w16cex="http://schemas.microsoft.com/office/word/2018/wordml/cex" xmlns:w16cid="http://schemas.microsoft.com/office/word/2016/wordml/cid" xmlns:w16="http://schemas.microsoft.com/office/word/2018/wordml" xmlns:w16du="http://schemas.microsoft.com/office/word/2023/wordml/word16du" xmlns:w16sdtdh="http://schemas.microsoft.com/office/word/2020/wordml/sdtdatahash" xmlns:w16sdtfl="http://schemas.microsoft.com/office/word/2024/wordml/sdtformatlock" xmlns:w16se="http://schemas.microsoft.com/office/word/2015/wordml/symex" xmlns:wpg="http://schemas.microsoft.com/office/word/2010/wordprocessingGroup" xmlns:wpi="http://schemas.microsoft.com/office/word/2010/wordprocessingInk" xmlns:wne="http://schemas.microsoft.com/office/word/2006/wordml" xmlns:wps="http://schemas.microsoft.com/office/word/2010/wordprocessingShape" mc:Ignorable="w14 w15 w16se w16cid w16 w16cex w16sdtdh w16sdtfl w16du wp14">
+<w:ftr xmlns:wpc="http://schemas.microsoft.com/office/word/2010/wordprocessingCanvas" xmlns:cx="http://schemas.microsoft.com/office/drawing/2014/chartex" xmlns:cx1="http://schemas.microsoft.com/office/drawing/2015/9/8/chartex" xmlns:cx2="http://schemas.microsoft.com/office/drawing/2015/10/21/chartex" xmlns:cx3="http://schemas.microsoft.com/office/drawing/2016/5/9/chartex" xmlns:cx4="http://schemas.microsoft.com/office/drawing/2016/5/10/chartex" xmlns:cx5="http://schemas.microsoft.com/office/drawing/2016/5/11/chartex" xmlns:cx6="http://schemas.microsoft.com/office/drawing/2016/5/12/chartex" xmlns:cx7="http://schemas.microsoft.com/office/drawing/2016/5/13/chartex" xmlns:cx8="http://schemas.microsoft.com/office/drawing/2016/5/14/chartex" xmlns:mc="http://schemas.openxmlformats.org/markup-compatibility/2006" xmlns:aink="http://schemas.microsoft.com/office/drawing/2016/ink" xmlns:am3d="http://schemas.microsoft.com/office/drawing/2017/model3d" xmlns:o="urn:schemas-microsoft-com:office:office" xmlns:oel="http://schemas.microsoft.com/office/2019/extlst" xmlns:r="http://schemas.openxmlformats.org/officeDocument/2006/relationships" xmlns:m="http://schemas.openxmlformats.org/officeDocument/2006/math" xmlns:v="urn:schemas-microsoft-com:vml" xmlns:wp14="http://schemas.microsoft.com/office/word/2010/wordprocessingDrawing" xmlns:wp="http://schemas.openxmlformats.org/drawingml/2006/wordprocessingDrawing" xmlns:w10="urn:schemas-microsoft-com:office:word" xmlns:w="http://schemas.openxmlformats.org/wordprocessingml/2006/main" xmlns:w14="http://schemas.microsoft.com/office/word/2010/wordml" xmlns:w15="http://schemas.microsoft.com/office/word/2012/wordml" xmlns:w16cei="http://schemas.microsoft.com/office/word/2026/wordml/cei" xmlns:w16cex="http://schemas.microsoft.com/office/word/2018/wordml/cex" xmlns:w16cid="http://schemas.microsoft.com/office/word/2016/wordml/cid" xmlns:w16="http://schemas.microsoft.com/office/word/2018/wordml" xmlns:w16du="http://schemas.microsoft.com/office/word/2023/wordml/word16du" xmlns:w16sdtdh="http://schemas.microsoft.com/office/word/2020/wordml/sdtdatahash" xmlns:w16sdtfl="http://schemas.microsoft.com/office/word/2024/wordml/sdtformatlock" xmlns:w16se="http://schemas.microsoft.com/office/word/2015/wordml/symex" xmlns:wpg="http://schemas.microsoft.com/office/word/2010/wordprocessingGroup" xmlns:wpi="http://schemas.microsoft.com/office/word/2010/wordprocessingInk" xmlns:wne="http://schemas.microsoft.com/office/word/2006/wordml" xmlns:wps="http://schemas.microsoft.com/office/word/2010/wordprocessingShape" mc:Ignorable="w14 w15 w16se w16cid w16 w16cex w16sdtdh w16sdtfl w16du wp14">
   <w:sdt>
     <w:sdtPr>
       <w:id w:val="1789160811"/>
@@ -3321,7 +3336,7 @@
 </file>
 
 <file path=word/footer2.xml><?xml version="1.0" encoding="utf-8"?>
-<w:ftr xmlns:wpc="http://schemas.microsoft.com/office/word/2010/wordprocessingCanvas" xmlns:cx="http://schemas.microsoft.com/office/drawing/2014/chartex" xmlns:cx1="http://schemas.microsoft.com/office/drawing/2015/9/8/chartex" xmlns:cx2="http://schemas.microsoft.com/office/drawing/2015/10/21/chartex" xmlns:cx3="http://schemas.microsoft.com/office/drawing/2016/5/9/chartex" xmlns:cx4="http://schemas.microsoft.com/office/drawing/2016/5/10/chartex" xmlns:cx5="http://schemas.microsoft.com/office/drawing/2016/5/11/chartex" xmlns:cx6="http://schemas.microsoft.com/office/drawing/2016/5/12/chartex" xmlns:cx7="http://schemas.microsoft.com/office/drawing/2016/5/13/chartex" xmlns:cx8="http://schemas.microsoft.com/office/drawing/2016/5/14/chartex" xmlns:mc="http://schemas.openxmlformats.org/markup-compatibility/2006" xmlns:aink="http://schemas.microsoft.com/office/drawing/2016/ink" xmlns:am3d="http://schemas.microsoft.com/office/drawing/2017/model3d" xmlns:o="urn:schemas-microsoft-com:office:office" xmlns:oel="http://schemas.microsoft.com/office/2019/extlst" xmlns:r="http://schemas.openxmlformats.org/officeDocument/2006/relationships" xmlns:m="http://schemas.openxmlformats.org/officeDocument/2006/math" xmlns:v="urn:schemas-microsoft-com:vml" xmlns:wp14="http://schemas.microsoft.com/office/word/2010/wordprocessingDrawing" xmlns:wp="http://schemas.openxmlformats.org/drawingml/2006/wordprocessingDrawing" xmlns:w10="urn:schemas-microsoft-com:office:word" xmlns:w="http://schemas.openxmlformats.org/wordprocessingml/2006/main" xmlns:w14="http://schemas.microsoft.com/office/word/2010/wordml" xmlns:w15="http://schemas.microsoft.com/office/word/2012/wordml" xmlns:w16cex="http://schemas.microsoft.com/office/word/2018/wordml/cex" xmlns:w16cid="http://schemas.microsoft.com/office/word/2016/wordml/cid" xmlns:w16="http://schemas.microsoft.com/office/word/2018/wordml" xmlns:w16du="http://schemas.microsoft.com/office/word/2023/wordml/word16du" xmlns:w16sdtdh="http://schemas.microsoft.com/office/word/2020/wordml/sdtdatahash" xmlns:w16sdtfl="http://schemas.microsoft.com/office/word/2024/wordml/sdtformatlock" xmlns:w16se="http://schemas.microsoft.com/office/word/2015/wordml/symex" xmlns:wpg="http://schemas.microsoft.com/office/word/2010/wordprocessingGroup" xmlns:wpi="http://schemas.microsoft.com/office/word/2010/wordprocessingInk" xmlns:wne="http://schemas.microsoft.com/office/word/2006/wordml" xmlns:wps="http://schemas.microsoft.com/office/word/2010/wordprocessingShape" mc:Ignorable="w14 w15 w16se w16cid w16 w16cex w16sdtdh w16sdtfl w16du wp14">
+<w:ftr xmlns:wpc="http://schemas.microsoft.com/office/word/2010/wordprocessingCanvas" xmlns:cx="http://schemas.microsoft.com/office/drawing/2014/chartex" xmlns:cx1="http://schemas.microsoft.com/office/drawing/2015/9/8/chartex" xmlns:cx2="http://schemas.microsoft.com/office/drawing/2015/10/21/chartex" xmlns:cx3="http://schemas.microsoft.com/office/drawing/2016/5/9/chartex" xmlns:cx4="http://schemas.microsoft.com/office/drawing/2016/5/10/chartex" xmlns:cx5="http://schemas.microsoft.com/office/drawing/2016/5/11/chartex" xmlns:cx6="http://schemas.microsoft.com/office/drawing/2016/5/12/chartex" xmlns:cx7="http://schemas.microsoft.com/office/drawing/2016/5/13/chartex" xmlns:cx8="http://schemas.microsoft.com/office/drawing/2016/5/14/chartex" xmlns:mc="http://schemas.openxmlformats.org/markup-compatibility/2006" xmlns:aink="http://schemas.microsoft.com/office/drawing/2016/ink" xmlns:am3d="http://schemas.microsoft.com/office/drawing/2017/model3d" xmlns:o="urn:schemas-microsoft-com:office:office" xmlns:oel="http://schemas.microsoft.com/office/2019/extlst" xmlns:r="http://schemas.openxmlformats.org/officeDocument/2006/relationships" xmlns:m="http://schemas.openxmlformats.org/officeDocument/2006/math" xmlns:v="urn:schemas-microsoft-com:vml" xmlns:wp14="http://schemas.microsoft.com/office/word/2010/wordprocessingDrawing" xmlns:wp="http://schemas.openxmlformats.org/drawingml/2006/wordprocessingDrawing" xmlns:w10="urn:schemas-microsoft-com:office:word" xmlns:w="http://schemas.openxmlformats.org/wordprocessingml/2006/main" xmlns:w14="http://schemas.microsoft.com/office/word/2010/wordml" xmlns:w15="http://schemas.microsoft.com/office/word/2012/wordml" xmlns:w16cei="http://schemas.microsoft.com/office/word/2026/wordml/cei" xmlns:w16cex="http://schemas.microsoft.com/office/word/2018/wordml/cex" xmlns:w16cid="http://schemas.microsoft.com/office/word/2016/wordml/cid" xmlns:w16="http://schemas.microsoft.com/office/word/2018/wordml" xmlns:w16du="http://schemas.microsoft.com/office/word/2023/wordml/word16du" xmlns:w16sdtdh="http://schemas.microsoft.com/office/word/2020/wordml/sdtdatahash" xmlns:w16sdtfl="http://schemas.microsoft.com/office/word/2024/wordml/sdtformatlock" xmlns:w16se="http://schemas.microsoft.com/office/word/2015/wordml/symex" xmlns:wpg="http://schemas.microsoft.com/office/word/2010/wordprocessingGroup" xmlns:wpi="http://schemas.microsoft.com/office/word/2010/wordprocessingInk" xmlns:wne="http://schemas.microsoft.com/office/word/2006/wordml" xmlns:wps="http://schemas.microsoft.com/office/word/2010/wordprocessingShape" mc:Ignorable="w14 w15 w16se w16cid w16 w16cex w16sdtdh w16sdtfl w16du wp14">
   <w:sdt>
     <w:sdtPr>
       <w:id w:val="-1312097854"/>
@@ -3374,7 +3389,7 @@
 </file>
 
 <file path=word/footnotes.xml><?xml version="1.0" encoding="utf-8"?>
-<w:footnotes xmlns:wpc="http://schemas.microsoft.com/office/word/2010/wordprocessingCanvas" xmlns:cx="http://schemas.microsoft.com/office/drawing/2014/chartex" xmlns:cx1="http://schemas.microsoft.com/office/drawing/2015/9/8/chartex" xmlns:cx2="http://schemas.microsoft.com/office/drawing/2015/10/21/chartex" xmlns:cx3="http://schemas.microsoft.com/office/drawing/2016/5/9/chartex" xmlns:cx4="http://schemas.microsoft.com/office/drawing/2016/5/10/chartex" xmlns:cx5="http://schemas.microsoft.com/office/drawing/2016/5/11/chartex" xmlns:cx6="http://schemas.microsoft.com/office/drawing/2016/5/12/chartex" xmlns:cx7="http://schemas.microsoft.com/office/drawing/2016/5/13/chartex" xmlns:cx8="http://schemas.microsoft.com/office/drawing/2016/5/14/chartex" xmlns:mc="http://schemas.openxmlformats.org/markup-compatibility/2006" xmlns:aink="http://schemas.microsoft.com/office/drawing/2016/ink" xmlns:am3d="http://schemas.microsoft.com/office/drawing/2017/model3d" xmlns:o="urn:schemas-microsoft-com:office:office" xmlns:oel="http://schemas.microsoft.com/office/2019/extlst" xmlns:r="http://schemas.openxmlformats.org/officeDocument/2006/relationships" xmlns:m="http://schemas.openxmlformats.org/officeDocument/2006/math" xmlns:v="urn:schemas-microsoft-com:vml" xmlns:wp14="http://schemas.microsoft.com/office/word/2010/wordprocessingDrawing" xmlns:wp="http://schemas.openxmlformats.org/drawingml/2006/wordprocessingDrawing" xmlns:w10="urn:schemas-microsoft-com:office:word" xmlns:w="http://schemas.openxmlformats.org/wordprocessingml/2006/main" xmlns:w14="http://schemas.microsoft.com/office/word/2010/wordml" xmlns:w15="http://schemas.microsoft.com/office/word/2012/wordml" xmlns:w16cex="http://schemas.microsoft.com/office/word/2018/wordml/cex" xmlns:w16cid="http://schemas.microsoft.com/office/word/2016/wordml/cid" xmlns:w16="http://schemas.microsoft.com/office/word/2018/wordml" xmlns:w16du="http://schemas.microsoft.com/office/word/2023/wordml/word16du" xmlns:w16sdtdh="http://schemas.microsoft.com/office/word/2020/wordml/sdtdatahash" xmlns:w16sdtfl="http://schemas.microsoft.com/office/word/2024/wordml/sdtformatlock" xmlns:w16se="http://schemas.microsoft.com/office/word/2015/wordml/symex" xmlns:wpg="http://schemas.microsoft.com/office/word/2010/wordprocessingGroup" xmlns:wpi="http://schemas.microsoft.com/office/word/2010/wordprocessingInk" xmlns:wne="http://schemas.microsoft.com/office/word/2006/wordml" xmlns:wps="http://schemas.microsoft.com/office/word/2010/wordprocessingShape" mc:Ignorable="w14 w15 w16se w16cid w16 w16cex w16sdtdh w16sdtfl w16du wp14">
+<w:footnotes xmlns:wpc="http://schemas.microsoft.com/office/word/2010/wordprocessingCanvas" xmlns:cx="http://schemas.microsoft.com/office/drawing/2014/chartex" xmlns:cx1="http://schemas.microsoft.com/office/drawing/2015/9/8/chartex" xmlns:cx2="http://schemas.microsoft.com/office/drawing/2015/10/21/chartex" xmlns:cx3="http://schemas.microsoft.com/office/drawing/2016/5/9/chartex" xmlns:cx4="http://schemas.microsoft.com/office/drawing/2016/5/10/chartex" xmlns:cx5="http://schemas.microsoft.com/office/drawing/2016/5/11/chartex" xmlns:cx6="http://schemas.microsoft.com/office/drawing/2016/5/12/chartex" xmlns:cx7="http://schemas.microsoft.com/office/drawing/2016/5/13/chartex" xmlns:cx8="http://schemas.microsoft.com/office/drawing/2016/5/14/chartex" xmlns:mc="http://schemas.openxmlformats.org/markup-compatibility/2006" xmlns:aink="http://schemas.microsoft.com/office/drawing/2016/ink" xmlns:am3d="http://schemas.microsoft.com/office/drawing/2017/model3d" xmlns:o="urn:schemas-microsoft-com:office:office" xmlns:oel="http://schemas.microsoft.com/office/2019/extlst" xmlns:r="http://schemas.openxmlformats.org/officeDocument/2006/relationships" xmlns:m="http://schemas.openxmlformats.org/officeDocument/2006/math" xmlns:v="urn:schemas-microsoft-com:vml" xmlns:wp14="http://schemas.microsoft.com/office/word/2010/wordprocessingDrawing" xmlns:wp="http://schemas.openxmlformats.org/drawingml/2006/wordprocessingDrawing" xmlns:w10="urn:schemas-microsoft-com:office:word" xmlns:w="http://schemas.openxmlformats.org/wordprocessingml/2006/main" xmlns:w14="http://schemas.microsoft.com/office/word/2010/wordml" xmlns:w15="http://schemas.microsoft.com/office/word/2012/wordml" xmlns:w16cei="http://schemas.microsoft.com/office/word/2026/wordml/cei" xmlns:w16cex="http://schemas.microsoft.com/office/word/2018/wordml/cex" xmlns:w16cid="http://schemas.microsoft.com/office/word/2016/wordml/cid" xmlns:w16="http://schemas.microsoft.com/office/word/2018/wordml" xmlns:w16du="http://schemas.microsoft.com/office/word/2023/wordml/word16du" xmlns:w16sdtdh="http://schemas.microsoft.com/office/word/2020/wordml/sdtdatahash" xmlns:w16sdtfl="http://schemas.microsoft.com/office/word/2024/wordml/sdtformatlock" xmlns:w16se="http://schemas.microsoft.com/office/word/2015/wordml/symex" xmlns:wpg="http://schemas.microsoft.com/office/word/2010/wordprocessingGroup" xmlns:wpi="http://schemas.microsoft.com/office/word/2010/wordprocessingInk" xmlns:wne="http://schemas.microsoft.com/office/word/2006/wordml" xmlns:wps="http://schemas.microsoft.com/office/word/2010/wordprocessingShape" mc:Ignorable="w14 w15 w16se w16cid w16 w16cex w16sdtdh w16sdtfl w16du wp14">
   <w:footnote w:type="separator" w:id="-1">
     <w:p>
       <w:pPr>
@@ -3399,7 +3414,7 @@
 </file>
 
 <file path=word/header1.xml><?xml version="1.0" encoding="utf-8"?>
-<w:hdr xmlns:wpc="http://schemas.microsoft.com/office/word/2010/wordprocessingCanvas" xmlns:cx="http://schemas.microsoft.com/office/drawing/2014/chartex" xmlns:cx1="http://schemas.microsoft.com/office/drawing/2015/9/8/chartex" xmlns:cx2="http://schemas.microsoft.com/office/drawing/2015/10/21/chartex" xmlns:cx3="http://schemas.microsoft.com/office/drawing/2016/5/9/chartex" xmlns:cx4="http://schemas.microsoft.com/office/drawing/2016/5/10/chartex" xmlns:cx5="http://schemas.microsoft.com/office/drawing/2016/5/11/chartex" xmlns:cx6="http://schemas.microsoft.com/office/drawing/2016/5/12/chartex" xmlns:cx7="http://schemas.microsoft.com/office/drawing/2016/5/13/chartex" xmlns:cx8="http://schemas.microsoft.com/office/drawing/2016/5/14/chartex" xmlns:mc="http://schemas.openxmlformats.org/markup-compatibility/2006" xmlns:aink="http://schemas.microsoft.com/office/drawing/2016/ink" xmlns:am3d="http://schemas.microsoft.com/office/drawing/2017/model3d" xmlns:o="urn:schemas-microsoft-com:office:office" xmlns:oel="http://schemas.microsoft.com/office/2019/extlst" xmlns:r="http://schemas.openxmlformats.org/officeDocument/2006/relationships" xmlns:m="http://schemas.openxmlformats.org/officeDocument/2006/math" xmlns:v="urn:schemas-microsoft-com:vml" xmlns:wp14="http://schemas.microsoft.com/office/word/2010/wordprocessingDrawing" xmlns:wp="http://schemas.openxmlformats.org/drawingml/2006/wordprocessingDrawing" xmlns:w10="urn:schemas-microsoft-com:office:word" xmlns:w="http://schemas.openxmlformats.org/wordprocessingml/2006/main" xmlns:w14="http://schemas.microsoft.com/office/word/2010/wordml" xmlns:w15="http://schemas.microsoft.com/office/word/2012/wordml" xmlns:w16cex="http://schemas.microsoft.com/office/word/2018/wordml/cex" xmlns:w16cid="http://schemas.microsoft.com/office/word/2016/wordml/cid" xmlns:w16="http://schemas.microsoft.com/office/word/2018/wordml" xmlns:w16du="http://schemas.microsoft.com/office/word/2023/wordml/word16du" xmlns:w16sdtdh="http://schemas.microsoft.com/office/word/2020/wordml/sdtdatahash" xmlns:w16sdtfl="http://schemas.microsoft.com/office/word/2024/wordml/sdtformatlock" xmlns:w16se="http://schemas.microsoft.com/office/word/2015/wordml/symex" xmlns:wpg="http://schemas.microsoft.com/office/word/2010/wordprocessingGroup" xmlns:wpi="http://schemas.microsoft.com/office/word/2010/wordprocessingInk" xmlns:wne="http://schemas.microsoft.com/office/word/2006/wordml" xmlns:wps="http://schemas.microsoft.com/office/word/2010/wordprocessingShape" mc:Ignorable="w14 w15 w16se w16cid w16 w16cex w16sdtdh w16sdtfl w16du wp14">
+<w:hdr xmlns:wpc="http://schemas.microsoft.com/office/word/2010/wordprocessingCanvas" xmlns:cx="http://schemas.microsoft.com/office/drawing/2014/chartex" xmlns:cx1="http://schemas.microsoft.com/office/drawing/2015/9/8/chartex" xmlns:cx2="http://schemas.microsoft.com/office/drawing/2015/10/21/chartex" xmlns:cx3="http://schemas.microsoft.com/office/drawing/2016/5/9/chartex" xmlns:cx4="http://schemas.microsoft.com/office/drawing/2016/5/10/chartex" xmlns:cx5="http://schemas.microsoft.com/office/drawing/2016/5/11/chartex" xmlns:cx6="http://schemas.microsoft.com/office/drawing/2016/5/12/chartex" xmlns:cx7="http://schemas.microsoft.com/office/drawing/2016/5/13/chartex" xmlns:cx8="http://schemas.microsoft.com/office/drawing/2016/5/14/chartex" xmlns:mc="http://schemas.openxmlformats.org/markup-compatibility/2006" xmlns:aink="http://schemas.microsoft.com/office/drawing/2016/ink" xmlns:am3d="http://schemas.microsoft.com/office/drawing/2017/model3d" xmlns:o="urn:schemas-microsoft-com:office:office" xmlns:oel="http://schemas.microsoft.com/office/2019/extlst" xmlns:r="http://schemas.openxmlformats.org/officeDocument/2006/relationships" xmlns:m="http://schemas.openxmlformats.org/officeDocument/2006/math" xmlns:v="urn:schemas-microsoft-com:vml" xmlns:wp14="http://schemas.microsoft.com/office/word/2010/wordprocessingDrawing" xmlns:wp="http://schemas.openxmlformats.org/drawingml/2006/wordprocessingDrawing" xmlns:w10="urn:schemas-microsoft-com:office:word" xmlns:w="http://schemas.openxmlformats.org/wordprocessingml/2006/main" xmlns:w14="http://schemas.microsoft.com/office/word/2010/wordml" xmlns:w15="http://schemas.microsoft.com/office/word/2012/wordml" xmlns:w16cei="http://schemas.microsoft.com/office/word/2026/wordml/cei" xmlns:w16cex="http://schemas.microsoft.com/office/word/2018/wordml/cex" xmlns:w16cid="http://schemas.microsoft.com/office/word/2016/wordml/cid" xmlns:w16="http://schemas.microsoft.com/office/word/2018/wordml" xmlns:w16du="http://schemas.microsoft.com/office/word/2023/wordml/word16du" xmlns:w16sdtdh="http://schemas.microsoft.com/office/word/2020/wordml/sdtdatahash" xmlns:w16sdtfl="http://schemas.microsoft.com/office/word/2024/wordml/sdtformatlock" xmlns:w16se="http://schemas.microsoft.com/office/word/2015/wordml/symex" xmlns:wpg="http://schemas.microsoft.com/office/word/2010/wordprocessingGroup" xmlns:wpi="http://schemas.microsoft.com/office/word/2010/wordprocessingInk" xmlns:wne="http://schemas.microsoft.com/office/word/2006/wordml" xmlns:wps="http://schemas.microsoft.com/office/word/2010/wordprocessingShape" mc:Ignorable="w14 w15 w16se w16cid w16 w16cex w16sdtdh w16sdtfl w16du wp14">
   <w:p>
     <w:pPr>
       <w:rPr>
@@ -4966,39 +4981,8 @@
 </file>
 
 <file path=customXml/item1.xml><?xml version="1.0" encoding="utf-8"?>
-<p:properties xmlns:p="http://schemas.microsoft.com/office/2006/metadata/properties" xmlns:xsi="http://www.w3.org/2001/XMLSchema-instance" xmlns:pc="http://schemas.microsoft.com/office/infopath/2007/PartnerControls">
-  <documentManagement>
-    <_ip_UnifiedCompliancePolicyUIAction xmlns="http://schemas.microsoft.com/sharepoint/v3" xsi:nil="true"/>
-    <MigrationWizId xmlns="10820b01-01be-460b-80f3-3a9f56841c3b" xsi:nil="true"/>
-    <MigrationWizIdSecurityGroups xmlns="10820b01-01be-460b-80f3-3a9f56841c3b" xsi:nil="true"/>
-    <MigrationWizIdPermissions xmlns="10820b01-01be-460b-80f3-3a9f56841c3b" xsi:nil="true"/>
-    <Page xmlns="10820b01-01be-460b-80f3-3a9f56841c3b">
-      <Url xsi:nil="true"/>
-      <Description xsi:nil="true"/>
-    </Page>
-    <lcf76f155ced4ddcb4097134ff3c332f xmlns="10820b01-01be-460b-80f3-3a9f56841c3b">
-      <Terms xmlns="http://schemas.microsoft.com/office/infopath/2007/PartnerControls"/>
-    </lcf76f155ced4ddcb4097134ff3c332f>
-    <_ip_UnifiedCompliancePolicyProperties xmlns="http://schemas.microsoft.com/sharepoint/v3" xsi:nil="true"/>
-    <MigrationWizIdDocumentLibraryPermissions xmlns="10820b01-01be-460b-80f3-3a9f56841c3b" xsi:nil="true"/>
-    <TaxCatchAll xmlns="1a75aaad-3466-4017-a44a-cd72d7792456"/>
-    <MigrationWizIdPermissionLevels xmlns="10820b01-01be-460b-80f3-3a9f56841c3b" xsi:nil="true"/>
-  </documentManagement>
-</p:properties>
-</file>
-
-<file path=customXml/item2.xml><?xml version="1.0" encoding="utf-8"?>
-<?mso-contentType ?>
-<FormTemplates xmlns="http://schemas.microsoft.com/sharepoint/v3/contenttype/forms">
-  <Display>DocumentLibraryForm</Display>
-  <Edit>DocumentLibraryForm</Edit>
-  <New>DocumentLibraryForm</New>
-</FormTemplates>
-</file>
-
-<file path=customXml/item3.xml><?xml version="1.0" encoding="utf-8"?>
-<ct:contentTypeSchema xmlns:ct="http://schemas.microsoft.com/office/2006/metadata/contentType" xmlns:ma="http://schemas.microsoft.com/office/2006/metadata/properties/metaAttributes" ct:_="" ma:_="" ma:contentTypeName="Document" ma:contentTypeID="0x010100197261E02930DF40A9B61B0AB18A45D2" ma:contentTypeVersion="60" ma:contentTypeDescription="Create a new document." ma:contentTypeScope="" ma:versionID="713af8a030d9ab373047cd7b4fa4fa93">
-  <xsd:schema xmlns:xsd="http://www.w3.org/2001/XMLSchema" xmlns:xs="http://www.w3.org/2001/XMLSchema" xmlns:p="http://schemas.microsoft.com/office/2006/metadata/properties" xmlns:ns1="http://schemas.microsoft.com/sharepoint/v3" xmlns:ns2="10820b01-01be-460b-80f3-3a9f56841c3b" xmlns:ns3="1a75aaad-3466-4017-a44a-cd72d7792456" targetNamespace="http://schemas.microsoft.com/office/2006/metadata/properties" ma:root="true" ma:fieldsID="fa3aa16cd396b1124449f1f7e4d0564c" ns1:_="" ns2:_="" ns3:_="">
+<ct:contentTypeSchema xmlns:ct="http://schemas.microsoft.com/office/2006/metadata/contentType" xmlns:ma="http://schemas.microsoft.com/office/2006/metadata/properties/metaAttributes" ct:_="" ma:_="" ma:contentTypeName="Document" ma:contentTypeID="0x010100197261E02930DF40A9B61B0AB18A45D2" ma:contentTypeVersion="60" ma:contentTypeDescription="Create a new document." ma:contentTypeScope="" ma:versionID="d3da2c262228c8734061c704229d8319">
+  <xsd:schema xmlns:xsd="http://www.w3.org/2001/XMLSchema" xmlns:xs="http://www.w3.org/2001/XMLSchema" xmlns:p="http://schemas.microsoft.com/office/2006/metadata/properties" xmlns:ns1="http://schemas.microsoft.com/sharepoint/v3" xmlns:ns2="10820b01-01be-460b-80f3-3a9f56841c3b" xmlns:ns3="1a75aaad-3466-4017-a44a-cd72d7792456" targetNamespace="http://schemas.microsoft.com/office/2006/metadata/properties" ma:root="true" ma:fieldsID="76c046a904d6aaa5222ac757a9b65265" ns1:_="" ns2:_="" ns3:_="">
     <xsd:import namespace="http://schemas.microsoft.com/sharepoint/v3"/>
     <xsd:import namespace="10820b01-01be-460b-80f3-3a9f56841c3b"/>
     <xsd:import namespace="1a75aaad-3466-4017-a44a-cd72d7792456"/>
@@ -5297,28 +5281,39 @@
 </ct:contentTypeSchema>
 </file>
 
-<file path=customXml/itemProps1.xml><?xml version="1.0" encoding="utf-8"?>
-<ds:datastoreItem xmlns:ds="http://schemas.openxmlformats.org/officeDocument/2006/customXml" ds:itemID="{49D369BA-1CFF-4A6B-820F-BD3FE683F245}">
-  <ds:schemaRefs>
-    <ds:schemaRef ds:uri="http://schemas.microsoft.com/office/2006/metadata/properties"/>
-    <ds:schemaRef ds:uri="http://schemas.microsoft.com/office/infopath/2007/PartnerControls"/>
-    <ds:schemaRef ds:uri="http://schemas.microsoft.com/sharepoint/v3"/>
-    <ds:schemaRef ds:uri="10820b01-01be-460b-80f3-3a9f56841c3b"/>
-    <ds:schemaRef ds:uri="1a75aaad-3466-4017-a44a-cd72d7792456"/>
-  </ds:schemaRefs>
-</ds:datastoreItem>
+<file path=customXml/item2.xml><?xml version="1.0" encoding="utf-8"?>
+<?mso-contentType ?>
+<FormTemplates xmlns="http://schemas.microsoft.com/sharepoint/v3/contenttype/forms">
+  <Display>DocumentLibraryForm</Display>
+  <Edit>DocumentLibraryForm</Edit>
+  <New>DocumentLibraryForm</New>
+</FormTemplates>
 </file>
 
-<file path=customXml/itemProps2.xml><?xml version="1.0" encoding="utf-8"?>
-<ds:datastoreItem xmlns:ds="http://schemas.openxmlformats.org/officeDocument/2006/customXml" ds:itemID="{25CCA662-58F7-4F05-BAE4-189991E3732F}">
-  <ds:schemaRefs>
-    <ds:schemaRef ds:uri="http://schemas.microsoft.com/sharepoint/v3/contenttype/forms"/>
-  </ds:schemaRefs>
-</ds:datastoreItem>
+<file path=customXml/item3.xml><?xml version="1.0" encoding="utf-8"?>
+<p:properties xmlns:p="http://schemas.microsoft.com/office/2006/metadata/properties" xmlns:xsi="http://www.w3.org/2001/XMLSchema-instance" xmlns:pc="http://schemas.microsoft.com/office/infopath/2007/PartnerControls">
+  <documentManagement>
+    <_ip_UnifiedCompliancePolicyUIAction xmlns="http://schemas.microsoft.com/sharepoint/v3" xsi:nil="true"/>
+    <MigrationWizId xmlns="10820b01-01be-460b-80f3-3a9f56841c3b" xsi:nil="true"/>
+    <MigrationWizIdSecurityGroups xmlns="10820b01-01be-460b-80f3-3a9f56841c3b" xsi:nil="true"/>
+    <MigrationWizIdPermissions xmlns="10820b01-01be-460b-80f3-3a9f56841c3b" xsi:nil="true"/>
+    <Page xmlns="10820b01-01be-460b-80f3-3a9f56841c3b">
+      <Url xsi:nil="true"/>
+      <Description xsi:nil="true"/>
+    </Page>
+    <lcf76f155ced4ddcb4097134ff3c332f xmlns="10820b01-01be-460b-80f3-3a9f56841c3b">
+      <Terms xmlns="http://schemas.microsoft.com/office/infopath/2007/PartnerControls"/>
+    </lcf76f155ced4ddcb4097134ff3c332f>
+    <_ip_UnifiedCompliancePolicyProperties xmlns="http://schemas.microsoft.com/sharepoint/v3" xsi:nil="true"/>
+    <MigrationWizIdDocumentLibraryPermissions xmlns="10820b01-01be-460b-80f3-3a9f56841c3b" xsi:nil="true"/>
+    <TaxCatchAll xmlns="1a75aaad-3466-4017-a44a-cd72d7792456" xsi:nil="true"/>
+    <MigrationWizIdPermissionLevels xmlns="10820b01-01be-460b-80f3-3a9f56841c3b" xsi:nil="true"/>
+  </documentManagement>
+</p:properties>
 </file>
 
-<file path=customXml/itemProps3.xml><?xml version="1.0" encoding="utf-8"?>
-<ds:datastoreItem xmlns:ds="http://schemas.openxmlformats.org/officeDocument/2006/customXml" ds:itemID="{DC566A0D-2858-48B8-AD48-21185B69EE3A}">
+<file path=customXml/itemProps1.xml><?xml version="1.0" encoding="utf-8"?>
+<ds:datastoreItem xmlns:ds="http://schemas.openxmlformats.org/officeDocument/2006/customXml" ds:itemID="{F177122D-20DE-4B15-9C1E-5C4262AA4EC3}">
   <ds:schemaRefs>
     <ds:schemaRef ds:uri="http://schemas.microsoft.com/office/2006/metadata/contentType"/>
     <ds:schemaRef ds:uri="http://schemas.microsoft.com/office/2006/metadata/properties/metaAttributes"/>
@@ -5337,6 +5332,26 @@
 </ds:datastoreItem>
 </file>
 
+<file path=customXml/itemProps2.xml><?xml version="1.0" encoding="utf-8"?>
+<ds:datastoreItem xmlns:ds="http://schemas.openxmlformats.org/officeDocument/2006/customXml" ds:itemID="{25CCA662-58F7-4F05-BAE4-189991E3732F}">
+  <ds:schemaRefs>
+    <ds:schemaRef ds:uri="http://schemas.microsoft.com/sharepoint/v3/contenttype/forms"/>
+  </ds:schemaRefs>
+</ds:datastoreItem>
+</file>
+
+<file path=customXml/itemProps3.xml><?xml version="1.0" encoding="utf-8"?>
+<ds:datastoreItem xmlns:ds="http://schemas.openxmlformats.org/officeDocument/2006/customXml" ds:itemID="{49D369BA-1CFF-4A6B-820F-BD3FE683F245}">
+  <ds:schemaRefs>
+    <ds:schemaRef ds:uri="http://schemas.microsoft.com/office/2006/metadata/properties"/>
+    <ds:schemaRef ds:uri="http://schemas.microsoft.com/office/infopath/2007/PartnerControls"/>
+    <ds:schemaRef ds:uri="http://schemas.microsoft.com/sharepoint/v3"/>
+    <ds:schemaRef ds:uri="10820b01-01be-460b-80f3-3a9f56841c3b"/>
+    <ds:schemaRef ds:uri="1a75aaad-3466-4017-a44a-cd72d7792456"/>
+  </ds:schemaRefs>
+</ds:datastoreItem>
+</file>
+
 <file path=docMetadata/LabelInfo.xml><?xml version="1.0" encoding="utf-8"?>
 <clbl:labelList xmlns:clbl="http://schemas.microsoft.com/office/2020/mipLabelMetadata">
   <clbl:label id="{37c354b2-85b0-47f5-b222-07b48d774ee3}" enabled="0" method="" siteId="{37c354b2-85b0-47f5-b222-07b48d774ee3}" removed="1"/>

</xml_diff>